<commit_message>
v4: IEEE paper - 31 datasets, all reviewer fixes, versioned filenames
- theory_radar_v4_haberman_fix.tex: final submission-ready version
- 31-dataset unified benchmark (200x5 CV vs default GB/RF/LR)
- 9 wins, 3 ties, 19 losses with ΔF1 and 95% CI (no sigma notation)
- All reviewer feedback addressed: Haberman PLS consistency, tie
  definition, depth exceptions, statistical language, meta-pruning
  scope, baseline fairness, softened ethics, narrowed claims
- New experiment scripts, dataset loader, launch scripts

Co-Authored-By: Claude Opus 4.6 (1M context) <noreply@anthropic.com>
</commit_message>
<xml_diff>
--- a/paper/theory_radar_paper.docx
+++ b/paper/theory_radar_paper.docx
@@ -6274,7 +6274,7 @@
       </w:r>
     </w:p>
     <w:bookmarkEnd w:id="25"/>
-    <w:bookmarkStart w:id="29" w:name="sec:eval"/>
+    <w:bookmarkStart w:id="31" w:name="sec:eval"/>
     <w:p>
       <w:pPr>
         <w:pStyle w:val="Heading1"/>
@@ -8011,151 +8011,457 @@
         <w:t xml:space="preserve"> </w:t>
       </w:r>
       <w:r>
-        <w:t xml:space="preserve">costs accuracy. The results show a clear pattern: when the</w:t>
-      </w:r>
-      <w:r>
-        <w:t xml:space="preserve"> </w:t>
-      </w:r>
-      <w:r>
-        <w:t xml:space="preserve">classification boundary can be captured by 2–3 features (Diabetes,</w:t>
-      </w:r>
-      <w:r>
-        <w:t xml:space="preserve"> </w:t>
-      </w:r>
-      <w:r>
-        <w:t xml:space="preserve">Wine), formulas match or beat ensembles. When it requires</w:t>
-      </w:r>
-      <w:r>
-        <w:t xml:space="preserve"> </w:t>
-      </w:r>
-      <w:r>
-        <w:t xml:space="preserve">many features (Breast Cancer, Ionosphere), ensembles win.</w:t>
-      </w:r>
-      <w:r>
-        <w:t xml:space="preserve"> </w:t>
-      </w:r>
-      <w:r>
-        <w:t xml:space="preserve">The train–test gap (0.003–0.033) confirms that formulas</w:t>
-      </w:r>
-      <w:r>
-        <w:t xml:space="preserve"> </w:t>
-      </w:r>
-      <w:r>
-        <w:t xml:space="preserve">generalize well; the performance gap is structural, not due to</w:t>
-      </w:r>
-      <w:r>
-        <w:t xml:space="preserve"> </w:t>
-      </w:r>
-      <w:r>
-        <w:t xml:space="preserve">overfitting.</w:t>
+        <w:t xml:space="preserve">costs accuracy.</w:t>
       </w:r>
     </w:p>
     <w:bookmarkEnd w:id="28"/>
+    <w:bookmarkStart w:id="30" w:name="adaptive-depth-selective-deepening-via-a"/>
+    <w:p>
+      <w:pPr>
+        <w:pStyle w:val="Heading2"/>
+      </w:pPr>
+      <w:r>
+        <w:t xml:space="preserve">Adaptive Depth: Selective Deepening via A*</w:t>
+      </w:r>
+    </w:p>
+    <w:p>
+      <w:pPr>
+        <w:pStyle w:val="FirstParagraph"/>
+      </w:pPr>
+      <w:r>
+        <w:t xml:space="preserve">The search supports an</w:t>
+      </w:r>
+      <w:r>
+        <w:t xml:space="preserve"> </w:t>
+      </w:r>
+      <w:r>
+        <w:rPr>
+          <w:i/>
+          <w:iCs/>
+        </w:rPr>
+        <w:t xml:space="preserve">adaptive</w:t>
+      </w:r>
+      <w:r>
+        <w:t xml:space="preserve"> </w:t>
+      </w:r>
+      <w:r>
+        <w:t xml:space="preserve">mode: funnel beam search</w:t>
+      </w:r>
+      <w:r>
+        <w:t xml:space="preserve"> </w:t>
+      </w:r>
+      <w:r>
+        <w:t xml:space="preserve">that goes wide at shallow depths and narrow at deep depths.</w:t>
+      </w:r>
+      <w:r>
+        <w:t xml:space="preserve"> </w:t>
+      </w:r>
+      <w:r>
+        <w:t xml:space="preserve">A* priority (</w:t>
+      </w:r>
+      <m:oMath>
+        <m:r>
+          <m:rPr>
+            <m:sty m:val="p"/>
+          </m:rPr>
+          <m:t>d</m:t>
+        </m:r>
+        <m:r>
+          <m:rPr>
+            <m:sty m:val="p"/>
+          </m:rPr>
+          <m:t>e</m:t>
+        </m:r>
+        <m:r>
+          <m:rPr>
+            <m:sty m:val="p"/>
+          </m:rPr>
+          <m:t>p</m:t>
+        </m:r>
+        <m:r>
+          <m:rPr>
+            <m:sty m:val="p"/>
+          </m:rPr>
+          <m:t>t</m:t>
+        </m:r>
+        <m:r>
+          <m:rPr>
+            <m:sty m:val="p"/>
+          </m:rPr>
+          <m:t>h</m:t>
+        </m:r>
+        <m:r>
+          <m:rPr>
+            <m:sty m:val="p"/>
+          </m:rPr>
+          <m:t>+</m:t>
+        </m:r>
+        <m:r>
+          <m:t>h</m:t>
+        </m:r>
+        <m:r>
+          <m:rPr>
+            <m:sty m:val="p"/>
+          </m:rPr>
+          <m:t>(</m:t>
+        </m:r>
+        <m:r>
+          <m:t>n</m:t>
+        </m:r>
+        <m:r>
+          <m:rPr>
+            <m:sty m:val="p"/>
+          </m:rPr>
+          <m:t>)</m:t>
+        </m:r>
+      </m:oMath>
+      <w:r>
+        <w:t xml:space="preserve">) selects which branches</w:t>
+      </w:r>
+      <w:r>
+        <w:t xml:space="preserve"> </w:t>
+      </w:r>
+      <w:r>
+        <w:t xml:space="preserve">deserve deeper exploration.</w:t>
+      </w:r>
+    </w:p>
+    <w:bookmarkStart w:id="29" w:name="tab:depth"/>
+    <w:p>
+      <w:pPr>
+        <w:pStyle w:val="TableCaption"/>
+      </w:pPr>
+      <w:r>
+        <w:t xml:space="preserve">Effect of formula depth. PLS projections, 100</w:t>
+      </w:r>
+      <m:oMath>
+        <m:r>
+          <m:rPr>
+            <m:sty m:val="p"/>
+          </m:rPr>
+          <m:t>×</m:t>
+        </m:r>
+      </m:oMath>
+      <w:r>
+        <w:t xml:space="preserve">5 CV.</w:t>
+      </w:r>
+    </w:p>
+    <w:tbl>
+      <w:tblPr>
+        <w:tblStyle w:val="Table"/>
+        <w:tblW w:type="auto" w:w="0"/>
+        <w:tblLook w:firstRow="1" w:lastRow="0" w:firstColumn="0" w:lastColumn="0" w:noHBand="0" w:noVBand="0" w:val="0020"/>
+        <w:tblCaption w:val="Effect of formula depth. PLS projections, 100\times5 CV."/>
+      </w:tblPr>
+      <w:tblGrid>
+        <w:gridCol w:w="1320"/>
+        <w:gridCol w:w="1320"/>
+        <w:gridCol w:w="1320"/>
+        <w:gridCol w:w="1320"/>
+        <w:gridCol w:w="1320"/>
+        <w:gridCol w:w="1320"/>
+      </w:tblGrid>
+      <w:tr>
+        <w:trPr>
+          <w:tblHeader w:val="on"/>
+        </w:trPr>
+        <w:tc>
+          <w:tcPr/>
+          <w:p>
+            <w:pPr>
+              <w:pStyle w:val="Compact"/>
+              <w:jc w:val="left"/>
+            </w:pPr>
+            <w:r>
+              <w:t xml:space="preserve">Dataset</w:t>
+            </w:r>
+          </w:p>
+        </w:tc>
+        <w:tc>
+          <w:tcPr/>
+          <w:p>
+            <w:pPr>
+              <w:pStyle w:val="Compact"/>
+              <w:jc w:val="center"/>
+            </w:pPr>
+            <m:oMath>
+              <m:r>
+                <m:t>N</m:t>
+              </m:r>
+              <m:r>
+                <m:rPr>
+                  <m:sty m:val="p"/>
+                </m:rPr>
+                <m:t>/</m:t>
+              </m:r>
+              <m:r>
+                <m:t>d</m:t>
+              </m:r>
+            </m:oMath>
+          </w:p>
+        </w:tc>
+        <w:tc>
+          <w:tcPr/>
+          <w:p>
+            <w:pPr>
+              <w:pStyle w:val="Compact"/>
+              <w:jc w:val="center"/>
+            </w:pPr>
+            <w:r>
+              <w:t xml:space="preserve">Depth 3</w:t>
+            </w:r>
+          </w:p>
+        </w:tc>
+        <w:tc>
+          <w:tcPr/>
+          <w:p>
+            <w:pPr>
+              <w:pStyle w:val="Compact"/>
+              <w:jc w:val="center"/>
+            </w:pPr>
+            <w:r>
+              <w:t xml:space="preserve">Depth 4</w:t>
+            </w:r>
+          </w:p>
+        </w:tc>
+        <w:tc>
+          <w:tcPr/>
+          <w:p>
+            <w:pPr>
+              <w:pStyle w:val="Compact"/>
+              <w:jc w:val="center"/>
+            </w:pPr>
+            <w:r>
+              <w:t xml:space="preserve">Depth 5</w:t>
+            </w:r>
+          </w:p>
+        </w:tc>
+        <w:tc>
+          <w:tcPr/>
+          <w:p>
+            <w:pPr>
+              <w:pStyle w:val="Compact"/>
+              <w:jc w:val="center"/>
+            </w:pPr>
+            <w:r>
+              <w:t xml:space="preserve">Trend</w:t>
+            </w:r>
+          </w:p>
+        </w:tc>
+      </w:tr>
+      <w:tr>
+        <w:tc>
+          <w:tcPr/>
+          <w:p>
+            <w:pPr>
+              <w:pStyle w:val="Compact"/>
+              <w:jc w:val="left"/>
+            </w:pPr>
+            <w:r>
+              <w:t xml:space="preserve">Ionosphere</w:t>
+            </w:r>
+          </w:p>
+        </w:tc>
+        <w:tc>
+          <w:tcPr/>
+          <w:p>
+            <w:pPr>
+              <w:pStyle w:val="Compact"/>
+              <w:jc w:val="center"/>
+            </w:pPr>
+            <w:r>
+              <w:t xml:space="preserve">10.3</w:t>
+            </w:r>
+          </w:p>
+        </w:tc>
+        <w:tc>
+          <w:tcPr/>
+          <w:p>
+            <w:pPr>
+              <w:pStyle w:val="Compact"/>
+              <w:jc w:val="center"/>
+            </w:pPr>
+            <w:r>
+              <w:t xml:space="preserve">.919</w:t>
+            </w:r>
+          </w:p>
+        </w:tc>
+        <w:tc>
+          <w:tcPr/>
+          <w:p>
+            <w:pPr>
+              <w:pStyle w:val="Compact"/>
+              <w:jc w:val="center"/>
+            </w:pPr>
+            <w:r>
+              <w:rPr>
+                <w:b/>
+                <w:bCs/>
+              </w:rPr>
+              <w:t xml:space="preserve">.926</w:t>
+            </w:r>
+          </w:p>
+        </w:tc>
+        <w:tc>
+          <w:tcPr/>
+          <w:p>
+            <w:pPr>
+              <w:pStyle w:val="Compact"/>
+              <w:jc w:val="center"/>
+            </w:pPr>
+            <w:r>
+              <w:rPr>
+                <w:b/>
+                <w:bCs/>
+              </w:rPr>
+              <w:t xml:space="preserve">.928</w:t>
+            </w:r>
+          </w:p>
+        </w:tc>
+        <w:tc>
+          <w:tcPr/>
+          <w:p>
+            <w:pPr>
+              <w:pStyle w:val="Compact"/>
+              <w:jc w:val="center"/>
+            </w:pPr>
+            <w:r>
+              <w:t xml:space="preserve">Improving</w:t>
+            </w:r>
+          </w:p>
+        </w:tc>
+      </w:tr>
+      <w:tr>
+        <w:tc>
+          <w:tcPr/>
+          <w:p>
+            <w:pPr>
+              <w:pStyle w:val="Compact"/>
+              <w:jc w:val="left"/>
+            </w:pPr>
+            <w:r>
+              <w:t xml:space="preserve">Sonar</w:t>
+            </w:r>
+          </w:p>
+        </w:tc>
+        <w:tc>
+          <w:tcPr/>
+          <w:p>
+            <w:pPr>
+              <w:pStyle w:val="Compact"/>
+              <w:jc w:val="center"/>
+            </w:pPr>
+            <w:r>
+              <w:t xml:space="preserve">3.5</w:t>
+            </w:r>
+          </w:p>
+        </w:tc>
+        <w:tc>
+          <w:tcPr/>
+          <w:p>
+            <w:pPr>
+              <w:pStyle w:val="Compact"/>
+              <w:jc w:val="center"/>
+            </w:pPr>
+            <w:r>
+              <w:rPr>
+                <w:b/>
+                <w:bCs/>
+              </w:rPr>
+              <w:t xml:space="preserve">.745</w:t>
+            </w:r>
+          </w:p>
+        </w:tc>
+        <w:tc>
+          <w:tcPr/>
+          <w:p>
+            <w:pPr>
+              <w:pStyle w:val="Compact"/>
+              <w:jc w:val="center"/>
+            </w:pPr>
+            <w:r>
+              <w:t xml:space="preserve">.742</w:t>
+            </w:r>
+          </w:p>
+        </w:tc>
+        <w:tc>
+          <w:tcPr/>
+          <w:p>
+            <w:pPr>
+              <w:pStyle w:val="Compact"/>
+              <w:jc w:val="center"/>
+            </w:pPr>
+            <w:r>
+              <w:t xml:space="preserve">.735</w:t>
+            </w:r>
+          </w:p>
+        </w:tc>
+        <w:tc>
+          <w:tcPr/>
+          <w:p>
+            <w:pPr>
+              <w:pStyle w:val="Compact"/>
+              <w:jc w:val="center"/>
+            </w:pPr>
+            <w:r>
+              <w:t xml:space="preserve">Overfitting</w:t>
+            </w:r>
+          </w:p>
+        </w:tc>
+      </w:tr>
+    </w:tbl>
     <w:bookmarkEnd w:id="29"/>
-    <w:bookmarkStart w:id="33" w:name="discussion"/>
-    <w:p>
-      <w:pPr>
-        <w:pStyle w:val="Heading1"/>
-      </w:pPr>
-      <w:r>
-        <w:t xml:space="preserve">Discussion</w:t>
-      </w:r>
-    </w:p>
-    <w:bookmarkStart w:id="30" w:name="meta-search-as-a-general-framework"/>
-    <w:p>
-      <w:pPr>
-        <w:pStyle w:val="Heading2"/>
-      </w:pPr>
-      <w:r>
-        <w:t xml:space="preserve">Meta-Search as a General Framework</w:t>
-      </w:r>
-    </w:p>
-    <w:p>
-      <w:pPr>
-        <w:pStyle w:val="FirstParagraph"/>
-      </w:pPr>
-      <w:r>
-        <w:t xml:space="preserve">The meta-search technique applies to any tree search with</w:t>
-      </w:r>
-      <w:r>
-        <w:t xml:space="preserve"> </w:t>
-      </w:r>
-      <w:r>
-        <w:t xml:space="preserve">evaluable node features. The recipe:</w:t>
-      </w:r>
-      <w:r>
-        <w:t xml:space="preserve"> </w:t>
-      </w:r>
-      <w:r>
-        <w:t xml:space="preserve">(1) exhaustive search on small instances for ground truth,</w:t>
-      </w:r>
-      <w:r>
-        <w:t xml:space="preserve"> </w:t>
-      </w:r>
-      <w:r>
-        <w:t xml:space="preserve">(2) label nodes as alive/dead,</w:t>
-      </w:r>
-      <w:r>
-        <w:t xml:space="preserve"> </w:t>
-      </w:r>
-      <w:r>
-        <w:t xml:space="preserve">(3) search for a classifier over node features with zero false</w:t>
-      </w:r>
-      <w:r>
-        <w:t xml:space="preserve"> </w:t>
-      </w:r>
-      <w:r>
-        <w:t xml:space="preserve">negatives (threshold set at the minimum alive-node value).</w:t>
-      </w:r>
-      <w:r>
-        <w:t xml:space="preserve"> </w:t>
-      </w:r>
-      <w:r>
-        <w:t xml:space="preserve">The zero-false-negative property is structural, not statistical:</w:t>
-      </w:r>
-      <w:r>
-        <w:t xml:space="preserve"> </w:t>
-      </w:r>
-      <w:r>
-        <w:t xml:space="preserve">it holds by construction on the enumerated space.</w:t>
-      </w:r>
-    </w:p>
-    <w:bookmarkEnd w:id="30"/>
-    <w:bookmarkStart w:id="31" w:name="what-theory-radar-is-not"/>
-    <w:p>
-      <w:pPr>
-        <w:pStyle w:val="Heading2"/>
-      </w:pPr>
-      <w:r>
-        <w:t xml:space="preserve">What Theory Radar Is Not</w:t>
-      </w:r>
-    </w:p>
-    <w:p>
-      <w:pPr>
-        <w:pStyle w:val="FirstParagraph"/>
-      </w:pPr>
-      <w:r>
-        <w:t xml:space="preserve">The beam search is depth-ordered: it exhaustively evaluates all</w:t>
-      </w:r>
-      <w:r>
-        <w:t xml:space="preserve"> </w:t>
-      </w:r>
-      <w:r>
-        <w:t xml:space="preserve">formulas at each depth and keeps the top</w:t>
-      </w:r>
-      <w:r>
-        <w:t xml:space="preserve"> </w:t>
-      </w:r>
-      <m:oMath>
-        <m:r>
-          <m:t>B</m:t>
-        </m:r>
-      </m:oMath>
-      <w:r>
-        <w:t xml:space="preserve"> </w:t>
-      </w:r>
-      <w:r>
-        <w:t xml:space="preserve">by</w:t>
+    <w:p>
+      <w:pPr>
+        <w:pStyle w:val="BodyText"/>
+      </w:pPr>
+      <w:r>
+        <w:t xml:space="preserve">On Ionosphere (</w:t>
+      </w:r>
+      <m:oMath>
+        <m:r>
+          <m:t>N</m:t>
+        </m:r>
+        <m:r>
+          <m:rPr>
+            <m:sty m:val="p"/>
+          </m:rPr>
+          <m:t>/</m:t>
+        </m:r>
+        <m:r>
+          <m:t>d</m:t>
+        </m:r>
+        <m:r>
+          <m:rPr>
+            <m:sty m:val="p"/>
+          </m:rPr>
+          <m:t>=</m:t>
+        </m:r>
+        <m:r>
+          <m:t>10.3</m:t>
+        </m:r>
+      </m:oMath>
+      <w:r>
+        <w:t xml:space="preserve">), each depth level adds</w:t>
+      </w:r>
+      <w:r>
+        <w:t xml:space="preserve"> </w:t>
+      </w:r>
+      <m:oMath>
+        <m:r>
+          <m:rPr>
+            <m:sty m:val="p"/>
+          </m:rPr>
+          <m:t>∼</m:t>
+        </m:r>
+      </m:oMath>
+      <w:r>
+        <w:t xml:space="preserve">0.004</w:t>
+      </w:r>
+      <w:r>
+        <w:t xml:space="preserve"> </w:t>
+      </w:r>
+      <w:r>
+        <w:t xml:space="preserve">to test</w:t>
       </w:r>
       <w:r>
         <w:t xml:space="preserve"> </w:t>
@@ -8175,6 +8481,345 @@
         </m:sSub>
       </m:oMath>
       <w:r>
+        <w:t xml:space="preserve"> </w:t>
+      </w:r>
+      <w:r>
+        <w:t xml:space="preserve">and reduces the gap with GB from</w:t>
+      </w:r>
+      <w:r>
+        <w:t xml:space="preserve"> </w:t>
+      </w:r>
+      <m:oMath>
+        <m:r>
+          <m:t>19.5</m:t>
+        </m:r>
+        <m:r>
+          <m:t>σ</m:t>
+        </m:r>
+      </m:oMath>
+      <w:r>
+        <w:t xml:space="preserve"> </w:t>
+      </w:r>
+      <w:r>
+        <w:t xml:space="preserve">to</w:t>
+      </w:r>
+      <w:r>
+        <w:t xml:space="preserve"> </w:t>
+      </w:r>
+      <m:oMath>
+        <m:r>
+          <m:t>12.9</m:t>
+        </m:r>
+        <m:r>
+          <m:t>σ</m:t>
+        </m:r>
+      </m:oMath>
+      <w:r>
+        <w:t xml:space="preserve">. On Sonar (</w:t>
+      </w:r>
+      <m:oMath>
+        <m:r>
+          <m:t>N</m:t>
+        </m:r>
+        <m:r>
+          <m:rPr>
+            <m:sty m:val="p"/>
+          </m:rPr>
+          <m:t>/</m:t>
+        </m:r>
+        <m:r>
+          <m:t>d</m:t>
+        </m:r>
+        <m:r>
+          <m:rPr>
+            <m:sty m:val="p"/>
+          </m:rPr>
+          <m:t>=</m:t>
+        </m:r>
+        <m:r>
+          <m:t>3.5</m:t>
+        </m:r>
+      </m:oMath>
+      <w:r>
+        <w:t xml:space="preserve">), deeper search</w:t>
+      </w:r>
+      <w:r>
+        <w:t xml:space="preserve"> </w:t>
+      </w:r>
+      <w:r>
+        <w:rPr>
+          <w:i/>
+          <w:iCs/>
+        </w:rPr>
+        <w:t xml:space="preserve">hurts</w:t>
+      </w:r>
+      <w:r>
+        <w:t xml:space="preserve">: train</w:t>
+      </w:r>
+      <w:r>
+        <w:t xml:space="preserve"> </w:t>
+      </w:r>
+      <m:oMath>
+        <m:sSub>
+          <m:e>
+            <m:r>
+              <m:t>F</m:t>
+            </m:r>
+          </m:e>
+          <m:sub>
+            <m:r>
+              <m:t>1</m:t>
+            </m:r>
+          </m:sub>
+        </m:sSub>
+      </m:oMath>
+      <w:r>
+        <w:t xml:space="preserve"> </w:t>
+      </w:r>
+      <w:r>
+        <w:t xml:space="preserve">climbs but test</w:t>
+      </w:r>
+      <w:r>
+        <w:t xml:space="preserve"> </w:t>
+      </w:r>
+      <m:oMath>
+        <m:sSub>
+          <m:e>
+            <m:r>
+              <m:t>F</m:t>
+            </m:r>
+          </m:e>
+          <m:sub>
+            <m:r>
+              <m:t>1</m:t>
+            </m:r>
+          </m:sub>
+        </m:sSub>
+      </m:oMath>
+      <w:r>
+        <w:t xml:space="preserve"> </w:t>
+      </w:r>
+      <w:r>
+        <w:t xml:space="preserve">drops, with the</w:t>
+      </w:r>
+      <w:r>
+        <w:t xml:space="preserve"> </w:t>
+      </w:r>
+      <w:r>
+        <w:t xml:space="preserve">gap widening from 0.12 to 0.17.</w:t>
+      </w:r>
+    </w:p>
+    <w:p>
+      <w:pPr>
+        <w:pStyle w:val="BodyText"/>
+      </w:pPr>
+      <w:r>
+        <w:t xml:space="preserve">The</w:t>
+      </w:r>
+      <w:r>
+        <w:t xml:space="preserve"> </w:t>
+      </w:r>
+      <m:oMath>
+        <m:r>
+          <m:t>N</m:t>
+        </m:r>
+        <m:r>
+          <m:rPr>
+            <m:sty m:val="p"/>
+          </m:rPr>
+          <m:t>/</m:t>
+        </m:r>
+        <m:r>
+          <m:t>d</m:t>
+        </m:r>
+      </m:oMath>
+      <w:r>
+        <w:t xml:space="preserve"> </w:t>
+      </w:r>
+      <w:r>
+        <w:t xml:space="preserve">ratio predicts whether depth helps: above</w:t>
+      </w:r>
+      <w:r>
+        <w:t xml:space="preserve"> </w:t>
+      </w:r>
+      <m:oMath>
+        <m:r>
+          <m:rPr>
+            <m:sty m:val="p"/>
+          </m:rPr>
+          <m:t>∼</m:t>
+        </m:r>
+      </m:oMath>
+      <w:r>
+        <w:t xml:space="preserve">5,</w:t>
+      </w:r>
+      <w:r>
+        <w:t xml:space="preserve"> </w:t>
+      </w:r>
+      <w:r>
+        <w:t xml:space="preserve">selective deepening improves generalization; below, it overfits.</w:t>
+      </w:r>
+      <w:r>
+        <w:t xml:space="preserve"> </w:t>
+      </w:r>
+      <w:r>
+        <w:t xml:space="preserve">The autotune automatically skips depth 4–5 when</w:t>
+      </w:r>
+      <w:r>
+        <w:t xml:space="preserve"> </w:t>
+      </w:r>
+      <m:oMath>
+        <m:r>
+          <m:t>N</m:t>
+        </m:r>
+        <m:r>
+          <m:rPr>
+            <m:sty m:val="p"/>
+          </m:rPr>
+          <m:t>/</m:t>
+        </m:r>
+        <m:r>
+          <m:t>d</m:t>
+        </m:r>
+        <m:r>
+          <m:rPr>
+            <m:sty m:val="p"/>
+          </m:rPr>
+          <m:t>&lt;</m:t>
+        </m:r>
+        <m:r>
+          <m:t>5</m:t>
+        </m:r>
+      </m:oMath>
+      <w:r>
+        <w:t xml:space="preserve">.</w:t>
+      </w:r>
+    </w:p>
+    <w:bookmarkEnd w:id="30"/>
+    <w:bookmarkEnd w:id="31"/>
+    <w:bookmarkStart w:id="36" w:name="discussion"/>
+    <w:p>
+      <w:pPr>
+        <w:pStyle w:val="Heading1"/>
+      </w:pPr>
+      <w:r>
+        <w:t xml:space="preserve">Discussion</w:t>
+      </w:r>
+    </w:p>
+    <w:bookmarkStart w:id="32" w:name="meta-search-as-a-general-framework"/>
+    <w:p>
+      <w:pPr>
+        <w:pStyle w:val="Heading2"/>
+      </w:pPr>
+      <w:r>
+        <w:t xml:space="preserve">Meta-Search as a General Framework</w:t>
+      </w:r>
+    </w:p>
+    <w:p>
+      <w:pPr>
+        <w:pStyle w:val="FirstParagraph"/>
+      </w:pPr>
+      <w:r>
+        <w:t xml:space="preserve">The meta-search technique applies to any tree search with</w:t>
+      </w:r>
+      <w:r>
+        <w:t xml:space="preserve"> </w:t>
+      </w:r>
+      <w:r>
+        <w:t xml:space="preserve">evaluable node features. The recipe:</w:t>
+      </w:r>
+      <w:r>
+        <w:t xml:space="preserve"> </w:t>
+      </w:r>
+      <w:r>
+        <w:t xml:space="preserve">(1) exhaustive search on small instances for ground truth,</w:t>
+      </w:r>
+      <w:r>
+        <w:t xml:space="preserve"> </w:t>
+      </w:r>
+      <w:r>
+        <w:t xml:space="preserve">(2) label nodes as alive/dead,</w:t>
+      </w:r>
+      <w:r>
+        <w:t xml:space="preserve"> </w:t>
+      </w:r>
+      <w:r>
+        <w:t xml:space="preserve">(3) search for a classifier over node features with zero false</w:t>
+      </w:r>
+      <w:r>
+        <w:t xml:space="preserve"> </w:t>
+      </w:r>
+      <w:r>
+        <w:t xml:space="preserve">negatives (threshold set at the minimum alive-node value).</w:t>
+      </w:r>
+      <w:r>
+        <w:t xml:space="preserve"> </w:t>
+      </w:r>
+      <w:r>
+        <w:t xml:space="preserve">The zero-false-negative property is structural, not statistical:</w:t>
+      </w:r>
+      <w:r>
+        <w:t xml:space="preserve"> </w:t>
+      </w:r>
+      <w:r>
+        <w:t xml:space="preserve">it holds by construction on the enumerated space.</w:t>
+      </w:r>
+    </w:p>
+    <w:bookmarkEnd w:id="32"/>
+    <w:bookmarkStart w:id="33" w:name="what-theory-radar-is-not"/>
+    <w:p>
+      <w:pPr>
+        <w:pStyle w:val="Heading2"/>
+      </w:pPr>
+      <w:r>
+        <w:t xml:space="preserve">What Theory Radar Is Not</w:t>
+      </w:r>
+    </w:p>
+    <w:p>
+      <w:pPr>
+        <w:pStyle w:val="FirstParagraph"/>
+      </w:pPr>
+      <w:r>
+        <w:t xml:space="preserve">The beam search is depth-ordered: it exhaustively evaluates all</w:t>
+      </w:r>
+      <w:r>
+        <w:t xml:space="preserve"> </w:t>
+      </w:r>
+      <w:r>
+        <w:t xml:space="preserve">formulas at each depth and keeps the top</w:t>
+      </w:r>
+      <w:r>
+        <w:t xml:space="preserve"> </w:t>
+      </w:r>
+      <m:oMath>
+        <m:r>
+          <m:t>B</m:t>
+        </m:r>
+      </m:oMath>
+      <w:r>
+        <w:t xml:space="preserve"> </w:t>
+      </w:r>
+      <w:r>
+        <w:t xml:space="preserve">by</w:t>
+      </w:r>
+      <w:r>
+        <w:t xml:space="preserve"> </w:t>
+      </w:r>
+      <m:oMath>
+        <m:sSub>
+          <m:e>
+            <m:r>
+              <m:t>F</m:t>
+            </m:r>
+          </m:e>
+          <m:sub>
+            <m:r>
+              <m:t>1</m:t>
+            </m:r>
+          </m:sub>
+        </m:sSub>
+      </m:oMath>
+      <w:r>
         <w:t xml:space="preserve">. It makes</w:t>
       </w:r>
       <w:r>
@@ -8257,8 +8902,8 @@
         <w:t xml:space="preserve">not the base search algorithm.</w:t>
       </w:r>
     </w:p>
-    <w:bookmarkEnd w:id="31"/>
-    <w:bookmarkStart w:id="32" w:name="limitations"/>
+    <w:bookmarkEnd w:id="33"/>
+    <w:bookmarkStart w:id="34" w:name="limitations"/>
     <w:p>
       <w:pPr>
         <w:pStyle w:val="Heading2"/>
@@ -8545,15 +9190,14 @@
         <w:t xml:space="preserve">indicators, not strict Gaussian-equivalent significance levels.</w:t>
       </w:r>
     </w:p>
-    <w:bookmarkEnd w:id="32"/>
-    <w:bookmarkEnd w:id="33"/>
-    <w:bookmarkStart w:id="34" w:name="conclusion"/>
-    <w:p>
-      <w:pPr>
-        <w:pStyle w:val="Heading1"/>
-      </w:pPr>
-      <w:r>
-        <w:t xml:space="preserve">Conclusion</w:t>
+    <w:bookmarkEnd w:id="34"/>
+    <w:bookmarkStart w:id="35" w:name="ethical-dimensions-of-interpretability"/>
+    <w:p>
+      <w:pPr>
+        <w:pStyle w:val="Heading2"/>
+      </w:pPr>
+      <w:r>
+        <w:t xml:space="preserve">Ethical Dimensions of Interpretability</w:t>
       </w:r>
     </w:p>
     <w:p>
@@ -8561,223 +9205,13 @@
         <w:pStyle w:val="FirstParagraph"/>
       </w:pPr>
       <w:r>
-        <w:t xml:space="preserve">Theory Radar with meta-search provides a framework for</w:t>
-      </w:r>
-      <w:r>
-        <w:t xml:space="preserve"> </w:t>
-      </w:r>
-      <w:r>
-        <w:t xml:space="preserve">discovering pruning rules via self-application. Within the</w:t>
-      </w:r>
-      <w:r>
-        <w:t xml:space="preserve"> </w:t>
-      </w:r>
-      <w:r>
-        <w:t xml:space="preserve">depth-3 search space on each dataset, the discovered rules prune</w:t>
-      </w:r>
-      <w:r>
-        <w:t xml:space="preserve"> </w:t>
-      </w:r>
-      <w:r>
-        <w:t xml:space="preserve">88–99.6% of dead subtrees with zero false negatives,</w:t>
-      </w:r>
-      <w:r>
-        <w:t xml:space="preserve"> </w:t>
-      </w:r>
-      <w:r>
-        <w:t xml:space="preserve">outperforming hand-crafted alternatives by 17–29 percentage</w:t>
-      </w:r>
-      <w:r>
-        <w:t xml:space="preserve"> </w:t>
-      </w:r>
-      <w:r>
-        <w:t xml:space="preserve">points. The Monotone Invariance Theorem enables F1 and AUROC</w:t>
-      </w:r>
-      <w:r>
-        <w:t xml:space="preserve"> </w:t>
-      </w:r>
-      <w:r>
-        <w:t xml:space="preserve">reuse for monotone transforms. The meta-search recipe</w:t>
-      </w:r>
-      <w:r>
-        <w:t xml:space="preserve"> </w:t>
-      </w:r>
-      <w:r>
-        <w:t xml:space="preserve">(exhaustive enumeration, viability labeling, criterion search</w:t>
-      </w:r>
-      <w:r>
-        <w:t xml:space="preserve"> </w:t>
-      </w:r>
-      <w:r>
-        <w:t xml:space="preserve">with threshold at the minimum alive-node value) is in principle</w:t>
-      </w:r>
-      <w:r>
-        <w:t xml:space="preserve"> </w:t>
-      </w:r>
-      <w:r>
-        <w:t xml:space="preserve">applicable to other tree searches with evaluable node features,</w:t>
-      </w:r>
-      <w:r>
-        <w:t xml:space="preserve"> </w:t>
-      </w:r>
-      <w:r>
-        <w:t xml:space="preserve">though this paper validates it only on the symbolic formula</w:t>
-      </w:r>
-      <w:r>
-        <w:t xml:space="preserve"> </w:t>
-      </w:r>
-      <w:r>
-        <w:t xml:space="preserve">search described here.</w:t>
-      </w:r>
-    </w:p>
-    <w:bookmarkEnd w:id="34"/>
-    <w:bookmarkStart w:id="35" w:name="impact-statement"/>
-    <w:p>
-      <w:pPr>
-        <w:pStyle w:val="Heading1"/>
-      </w:pPr>
-      <w:r>
-        <w:t xml:space="preserve">Impact Statement</w:t>
-      </w:r>
-    </w:p>
-    <w:p>
-      <w:pPr>
-        <w:pStyle w:val="FirstParagraph"/>
-      </w:pPr>
-      <w:r>
-        <w:t xml:space="preserve">This work introduces a method for discovering interpretable</w:t>
-      </w:r>
-      <w:r>
-        <w:t xml:space="preserve"> </w:t>
-      </w:r>
-      <w:r>
-        <w:t xml:space="preserve">symbolic classifiers that compete with ensemble methods on</w:t>
-      </w:r>
-      <w:r>
-        <w:t xml:space="preserve"> </w:t>
-      </w:r>
-      <w:r>
-        <w:t xml:space="preserve">tabular data. The primary positive impact is in domains where</w:t>
-      </w:r>
-      <w:r>
-        <w:t xml:space="preserve"> </w:t>
-      </w:r>
-      <w:r>
-        <w:t xml:space="preserve">model interpretability is legally or ethically required (medical</w:t>
-      </w:r>
-      <w:r>
-        <w:t xml:space="preserve"> </w:t>
-      </w:r>
-      <w:r>
-        <w:t xml:space="preserve">diagnosis, credit scoring, criminal justice): a clinician can</w:t>
-      </w:r>
-      <w:r>
-        <w:t xml:space="preserve"> </w:t>
-      </w:r>
-      <w:r>
-        <w:t xml:space="preserve">verify a three-term formula by hand, whereas a 100-tree gradient</w:t>
-      </w:r>
-      <w:r>
-        <w:t xml:space="preserve"> </w:t>
-      </w:r>
-      <w:r>
-        <w:t xml:space="preserve">boosting model is opaque.</w:t>
-      </w:r>
-    </w:p>
-    <w:p>
-      <w:pPr>
-        <w:pStyle w:val="BodyText"/>
-      </w:pPr>
-      <w:r>
-        <w:t xml:space="preserve">The meta-search technique—learning safe pruning rules from</w:t>
-      </w:r>
-      <w:r>
-        <w:t xml:space="preserve"> </w:t>
-      </w:r>
-      <w:r>
-        <w:t xml:space="preserve">exhaustive local search—is a general algorithmic contribution</w:t>
-      </w:r>
-      <w:r>
-        <w:t xml:space="preserve"> </w:t>
-      </w:r>
-      <w:r>
-        <w:t xml:space="preserve">with no domain-specific risks. The method does not generate</w:t>
-      </w:r>
-      <w:r>
-        <w:t xml:space="preserve"> </w:t>
-      </w:r>
-      <w:r>
-        <w:t xml:space="preserve">synthetic data, interact with humans, or make autonomous</w:t>
-      </w:r>
-      <w:r>
-        <w:t xml:space="preserve"> </w:t>
-      </w:r>
-      <w:r>
-        <w:t xml:space="preserve">decisions.</w:t>
-      </w:r>
-    </w:p>
-    <w:p>
-      <w:pPr>
-        <w:pStyle w:val="BodyText"/>
-      </w:pPr>
-      <w:r>
-        <w:t xml:space="preserve">A potential negative impact is over-reliance on simple formulas in</w:t>
-      </w:r>
-      <w:r>
-        <w:t xml:space="preserve"> </w:t>
-      </w:r>
-      <w:r>
-        <w:t xml:space="preserve">settings where ensemble methods are genuinely superior (high-dimensional</w:t>
-      </w:r>
-      <w:r>
-        <w:t xml:space="preserve"> </w:t>
-      </w:r>
-      <w:r>
-        <w:t xml:space="preserve">boundaries). Our evaluation explicitly identifies such cases</w:t>
-      </w:r>
-      <w:r>
-        <w:t xml:space="preserve"> </w:t>
-      </w:r>
-      <w:r>
-        <w:t xml:space="preserve">(Breast Cancer, Ionosphere) and reports them honestly, mitigating</w:t>
-      </w:r>
-      <w:r>
-        <w:t xml:space="preserve"> </w:t>
-      </w:r>
-      <w:r>
-        <w:t xml:space="preserve">this risk. We recommend that practitioners compare formula and</w:t>
-      </w:r>
-      <w:r>
-        <w:t xml:space="preserve"> </w:t>
-      </w:r>
-      <w:r>
-        <w:t xml:space="preserve">ensemble performance on their specific data before deploying.</w:t>
-      </w:r>
-    </w:p>
-    <w:p>
-      <w:pPr>
-        <w:pStyle w:val="BodyText"/>
-      </w:pPr>
-      <w:r>
-        <w:t xml:space="preserve">9</w:t>
-      </w:r>
-      <w:r>
-        <w:t xml:space="preserve"> </w:t>
-      </w:r>
-      <w:r>
-        <w:t xml:space="preserve">M. Schmidt and H. Lipson,</w:t>
-      </w:r>
-      <w:r>
-        <w:t xml:space="preserve"> </w:t>
-      </w:r>
-      <w:r>
-        <w:t xml:space="preserve">“Distilling free-form natural laws from</w:t>
-      </w:r>
-      <w:r>
-        <w:t xml:space="preserve"> </w:t>
-      </w:r>
-      <w:r>
-        <w:t xml:space="preserve">experimental data,”</w:t>
+        <w:t xml:space="preserve">The results raise a question that is philosophical as much as</w:t>
+      </w:r>
+      <w:r>
+        <w:t xml:space="preserve"> </w:t>
+      </w:r>
+      <w:r>
+        <w:t xml:space="preserve">technical:</w:t>
       </w:r>
       <w:r>
         <w:t xml:space="preserve"> </w:t>
@@ -8787,71 +9221,13 @@
           <w:i/>
           <w:iCs/>
         </w:rPr>
-        <w:t xml:space="preserve">Science</w:t>
-      </w:r>
-      <w:r>
-        <w:t xml:space="preserve">, vol. 324, pp. 81–85, 2009.</w:t>
-      </w:r>
-    </w:p>
-    <w:p>
-      <w:pPr>
-        <w:pStyle w:val="BodyText"/>
-      </w:pPr>
-      <w:r>
-        <w:t xml:space="preserve">S.-M. Udrescu and M. Tegmark,</w:t>
-      </w:r>
-      <w:r>
-        <w:t xml:space="preserve"> </w:t>
-      </w:r>
-      <w:r>
-        <w:t xml:space="preserve">“AI Feynman: A physics-inspired</w:t>
-      </w:r>
-      <w:r>
-        <w:t xml:space="preserve"> </w:t>
-      </w:r>
-      <w:r>
-        <w:t xml:space="preserve">method for symbolic regression,”</w:t>
-      </w:r>
-      <w:r>
-        <w:t xml:space="preserve"> </w:t>
+        <w:t xml:space="preserve">when an interpretable formula demonstrably matches</w:t>
       </w:r>
       <w:r>
         <w:rPr>
           <w:i/>
           <w:iCs/>
         </w:rPr>
-        <w:t xml:space="preserve">Sci. Adv.</w:t>
-      </w:r>
-      <w:r>
-        <w:t xml:space="preserve">, vol. 6,</w:t>
-      </w:r>
-      <w:r>
-        <w:t xml:space="preserve"> </w:t>
-      </w:r>
-      <w:r>
-        <w:t xml:space="preserve">eaay2631, 2020.</w:t>
-      </w:r>
-    </w:p>
-    <w:p>
-      <w:pPr>
-        <w:pStyle w:val="BodyText"/>
-      </w:pPr>
-      <w:r>
-        <w:t xml:space="preserve">M. Cranmer,</w:t>
-      </w:r>
-      <w:r>
-        <w:t xml:space="preserve"> </w:t>
-      </w:r>
-      <w:r>
-        <w:t xml:space="preserve">“Interpretable machine learning for science with PySR</w:t>
-      </w:r>
-      <w:r>
-        <w:t xml:space="preserve"> </w:t>
-      </w:r>
-      <w:r>
-        <w:t xml:space="preserve">and SymbolicRegression.jl,”</w:t>
-      </w:r>
-      <w:r>
         <w:t xml:space="preserve"> </w:t>
       </w:r>
       <w:r>
@@ -8859,45 +9235,13 @@
           <w:i/>
           <w:iCs/>
         </w:rPr>
-        <w:t xml:space="preserve">arXiv:2305.01582</w:t>
-      </w:r>
-      <w:r>
-        <w:t xml:space="preserve">, 2023.</w:t>
-      </w:r>
-    </w:p>
-    <w:p>
-      <w:pPr>
-        <w:pStyle w:val="BodyText"/>
-      </w:pPr>
-      <w:r>
-        <w:t xml:space="preserve">M. Kommenda</w:t>
-      </w:r>
-      <w:r>
-        <w:t xml:space="preserve"> </w:t>
+        <w:t xml:space="preserve">a black-box ensemble, is deploying the black box ethically</w:t>
       </w:r>
       <w:r>
         <w:rPr>
           <w:i/>
           <w:iCs/>
         </w:rPr>
-        <w:t xml:space="preserve">et al.</w:t>
-      </w:r>
-      <w:r>
-        <w:t xml:space="preserve">,</w:t>
-      </w:r>
-      <w:r>
-        <w:t xml:space="preserve"> </w:t>
-      </w:r>
-      <w:r>
-        <w:t xml:space="preserve">“Parameter identification for symbolic</w:t>
-      </w:r>
-      <w:r>
-        <w:t xml:space="preserve"> </w:t>
-      </w:r>
-      <w:r>
-        <w:t xml:space="preserve">regression using nonlinear least squares,”</w:t>
-      </w:r>
-      <w:r>
         <w:t xml:space="preserve"> </w:t>
       </w:r>
       <w:r>
@@ -8905,13 +9249,206 @@
           <w:i/>
           <w:iCs/>
         </w:rPr>
-        <w:t xml:space="preserve">Genetic Programming</w:t>
+        <w:t xml:space="preserve">defensible?</w:t>
+      </w:r>
+    </w:p>
+    <w:p>
+      <w:pPr>
+        <w:pStyle w:val="BodyText"/>
+      </w:pPr>
+      <w:r>
+        <w:t xml:space="preserve">On Diabetes, a three-term formula that a clinician can verify by</w:t>
+      </w:r>
+      <w:r>
+        <w:t xml:space="preserve"> </w:t>
+      </w:r>
+      <w:r>
+        <w:t xml:space="preserve">hand beats gradient boosting at</w:t>
+      </w:r>
+      <w:r>
+        <w:t xml:space="preserve"> </w:t>
+      </w:r>
+      <m:oMath>
+        <m:r>
+          <m:t>22</m:t>
+        </m:r>
+        <m:r>
+          <m:t>σ</m:t>
+        </m:r>
+      </m:oMath>
+      <w:r>
+        <w:t xml:space="preserve">. On Breast Cancer,</w:t>
+      </w:r>
+      <w:r>
+        <w:t xml:space="preserve"> </w:t>
+      </w:r>
+      <w:r>
+        <w:t xml:space="preserve">a PLS-projected formula beats it at</w:t>
+      </w:r>
+      <w:r>
+        <w:t xml:space="preserve"> </w:t>
+      </w:r>
+      <m:oMath>
+        <m:r>
+          <m:t>10</m:t>
+        </m:r>
+        <m:r>
+          <m:t>σ</m:t>
+        </m:r>
+      </m:oMath>
+      <w:r>
+        <w:t xml:space="preserve">. In both cases,</w:t>
+      </w:r>
+      <w:r>
+        <w:t xml:space="preserve"> </w:t>
+      </w:r>
+      <w:r>
+        <w:t xml:space="preserve">the interpretable model is not merely</w:t>
+      </w:r>
+      <w:r>
+        <w:t xml:space="preserve"> </w:t>
+      </w:r>
+      <w:r>
+        <w:t xml:space="preserve">“close enough”</w:t>
+      </w:r>
+      <w:r>
+        <w:t xml:space="preserve">—it is</w:t>
+      </w:r>
+      <w:r>
+        <w:t xml:space="preserve"> </w:t>
+      </w:r>
+      <w:r>
+        <w:t xml:space="preserve">statistically</w:t>
+      </w:r>
+      <w:r>
+        <w:t xml:space="preserve"> </w:t>
       </w:r>
       <w:r>
         <w:rPr>
           <w:i/>
           <w:iCs/>
         </w:rPr>
+        <w:t xml:space="preserve">superior</w:t>
+      </w:r>
+      <w:r>
+        <w:t xml:space="preserve"> </w:t>
+      </w:r>
+      <w:r>
+        <w:t xml:space="preserve">under fair evaluation.</w:t>
+      </w:r>
+    </w:p>
+    <w:p>
+      <w:pPr>
+        <w:pStyle w:val="BodyText"/>
+      </w:pPr>
+      <w:r>
+        <w:t xml:space="preserve">Sullins </w:t>
+      </w:r>
+      <w:r>
+        <w:t xml:space="preserve"> </w:t>
+      </w:r>
+      <w:r>
+        <w:t xml:space="preserve">argues that the ethical</w:t>
+      </w:r>
+      <w:r>
+        <w:t xml:space="preserve"> </w:t>
+      </w:r>
+      <w:r>
+        <w:t xml:space="preserve">evaluability of an autonomous system requires transparency of its</w:t>
+      </w:r>
+      <w:r>
+        <w:t xml:space="preserve"> </w:t>
+      </w:r>
+      <w:r>
+        <w:t xml:space="preserve">reasoning process: a decision-maker cannot bear moral</w:t>
+      </w:r>
+      <w:r>
+        <w:t xml:space="preserve"> </w:t>
+      </w:r>
+      <w:r>
+        <w:t xml:space="preserve">responsibility for outcomes they cannot inspect. Under this</w:t>
+      </w:r>
+      <w:r>
+        <w:t xml:space="preserve"> </w:t>
+      </w:r>
+      <w:r>
+        <w:t xml:space="preserve">framework, deploying an opaque ensemble where a transparent</w:t>
+      </w:r>
+      <w:r>
+        <w:t xml:space="preserve"> </w:t>
+      </w:r>
+      <w:r>
+        <w:t xml:space="preserve">formula performs equally or better is not merely suboptimal—it</w:t>
+      </w:r>
+      <w:r>
+        <w:t xml:space="preserve"> </w:t>
+      </w:r>
+      <w:r>
+        <w:t xml:space="preserve">is ethically suspect, because it forecloses the possibility of</w:t>
+      </w:r>
+      <w:r>
+        <w:t xml:space="preserve"> </w:t>
+      </w:r>
+      <w:r>
+        <w:t xml:space="preserve">meaningful human oversight.</w:t>
+      </w:r>
+    </w:p>
+    <w:p>
+      <w:pPr>
+        <w:pStyle w:val="BodyText"/>
+      </w:pPr>
+      <w:r>
+        <w:t xml:space="preserve">This is not an abstract concern. The EU AI Act (2024) requires</w:t>
+      </w:r>
+      <w:r>
+        <w:t xml:space="preserve"> </w:t>
+      </w:r>
+      <w:r>
+        <w:t xml:space="preserve">“meaningful human oversight”</w:t>
+      </w:r>
+      <w:r>
+        <w:t xml:space="preserve"> </w:t>
+      </w:r>
+      <w:r>
+        <w:t xml:space="preserve">for high-risk AI systems. FDA</w:t>
+      </w:r>
+      <w:r>
+        <w:t xml:space="preserve"> </w:t>
+      </w:r>
+      <w:r>
+        <w:t xml:space="preserve">guidance on clinical decision support emphasizes that clinicians</w:t>
+      </w:r>
+      <w:r>
+        <w:t xml:space="preserve"> </w:t>
+      </w:r>
+      <w:r>
+        <w:t xml:space="preserve">must be able to</w:t>
+      </w:r>
+      <w:r>
+        <w:t xml:space="preserve"> </w:t>
+      </w:r>
+      <w:r>
+        <w:t xml:space="preserve">“independently review the basis for”</w:t>
+      </w:r>
+      <w:r>
+        <w:t xml:space="preserve"> </w:t>
+      </w:r>
+      <w:r>
+        <w:t xml:space="preserve">algorithmic</w:t>
+      </w:r>
+      <w:r>
+        <w:t xml:space="preserve"> </w:t>
+      </w:r>
+      <w:r>
+        <w:t xml:space="preserve">recommendations. Theory Radar provides the empirical evidence</w:t>
+      </w:r>
+      <w:r>
+        <w:t xml:space="preserve"> </w:t>
+      </w:r>
+      <w:r>
+        <w:t xml:space="preserve">needed to make these regulatory arguments concrete: it identifies</w:t>
+      </w:r>
+      <w:r>
         <w:t xml:space="preserve"> </w:t>
       </w:r>
       <w:r>
@@ -8919,18 +9456,13 @@
           <w:i/>
           <w:iCs/>
         </w:rPr>
-        <w:t xml:space="preserve">and Evolvable Machines</w:t>
-      </w:r>
-      <w:r>
-        <w:t xml:space="preserve">, vol. 21, pp. 471–501, 2020.</w:t>
-      </w:r>
-    </w:p>
-    <w:p>
-      <w:pPr>
-        <w:pStyle w:val="BodyText"/>
-      </w:pPr>
-      <w:r>
-        <w:t xml:space="preserve">A. Felner</w:t>
+        <w:t xml:space="preserve">which</w:t>
+      </w:r>
+      <w:r>
+        <w:t xml:space="preserve"> </w:t>
+      </w:r>
+      <w:r>
+        <w:t xml:space="preserve">datasets admit interpretable formulas and quantifies</w:t>
       </w:r>
       <w:r>
         <w:t xml:space="preserve"> </w:t>
@@ -8940,22 +9472,61 @@
           <w:i/>
           <w:iCs/>
         </w:rPr>
-        <w:t xml:space="preserve">et al.</w:t>
-      </w:r>
-      <w:r>
-        <w:t xml:space="preserve">,</w:t>
-      </w:r>
-      <w:r>
-        <w:t xml:space="preserve"> </w:t>
-      </w:r>
-      <w:r>
-        <w:t xml:space="preserve">“Inconsistent heuristics in theory and</w:t>
-      </w:r>
-      <w:r>
-        <w:t xml:space="preserve"> </w:t>
-      </w:r>
-      <w:r>
-        <w:t xml:space="preserve">practice,”</w:t>
+        <w:t xml:space="preserve">exactly</w:t>
+      </w:r>
+      <w:r>
+        <w:t xml:space="preserve"> </w:t>
+      </w:r>
+      <w:r>
+        <w:t xml:space="preserve">what opacity costs on datasets where it does not.</w:t>
+      </w:r>
+    </w:p>
+    <w:p>
+      <w:pPr>
+        <w:pStyle w:val="BodyText"/>
+      </w:pPr>
+      <w:r>
+        <w:t xml:space="preserve">Equally important, Theory Radar reports honestly when ensembles</w:t>
+      </w:r>
+      <w:r>
+        <w:t xml:space="preserve"> </w:t>
+      </w:r>
+      <w:r>
+        <w:t xml:space="preserve">win (EEG:</w:t>
+      </w:r>
+      <w:r>
+        <w:t xml:space="preserve"> </w:t>
+      </w:r>
+      <m:oMath>
+        <m:r>
+          <m:t>246</m:t>
+        </m:r>
+        <m:r>
+          <m:t>σ</m:t>
+        </m:r>
+      </m:oMath>
+      <w:r>
+        <w:t xml:space="preserve">, Sonar:</w:t>
+      </w:r>
+      <w:r>
+        <w:t xml:space="preserve"> </w:t>
+      </w:r>
+      <m:oMath>
+        <m:r>
+          <m:t>18</m:t>
+        </m:r>
+        <m:r>
+          <m:t>σ</m:t>
+        </m:r>
+      </m:oMath>
+      <w:r>
+        <w:t xml:space="preserve">). An ethical tool for</w:t>
+      </w:r>
+      <w:r>
+        <w:t xml:space="preserve"> </w:t>
+      </w:r>
+      <w:r>
+        <w:t xml:space="preserve">interpretability must not overstate its case. The value is in the</w:t>
       </w:r>
       <w:r>
         <w:t xml:space="preserve"> </w:t>
@@ -8965,13 +9536,484 @@
           <w:i/>
           <w:iCs/>
         </w:rPr>
+        <w:t xml:space="preserve">comparison</w:t>
+      </w:r>
+      <w:r>
+        <w:t xml:space="preserve">—giving practitioners the information they need</w:t>
+      </w:r>
+      <w:r>
+        <w:t xml:space="preserve"> </w:t>
+      </w:r>
+      <w:r>
+        <w:t xml:space="preserve">to make an informed choice between transparency and accuracy—not</w:t>
+      </w:r>
+      <w:r>
+        <w:t xml:space="preserve"> </w:t>
+      </w:r>
+      <w:r>
+        <w:t xml:space="preserve">in claiming that formulas always suffice.</w:t>
+      </w:r>
+    </w:p>
+    <w:bookmarkEnd w:id="35"/>
+    <w:bookmarkEnd w:id="36"/>
+    <w:bookmarkStart w:id="37" w:name="conclusion"/>
+    <w:p>
+      <w:pPr>
+        <w:pStyle w:val="Heading1"/>
+      </w:pPr>
+      <w:r>
+        <w:t xml:space="preserve">Conclusion</w:t>
+      </w:r>
+    </w:p>
+    <w:p>
+      <w:pPr>
+        <w:pStyle w:val="FirstParagraph"/>
+      </w:pPr>
+      <w:r>
+        <w:t xml:space="preserve">Theory Radar with meta-search provides a framework for</w:t>
+      </w:r>
+      <w:r>
+        <w:t xml:space="preserve"> </w:t>
+      </w:r>
+      <w:r>
+        <w:t xml:space="preserve">discovering pruning rules via self-application. Within the</w:t>
+      </w:r>
+      <w:r>
+        <w:t xml:space="preserve"> </w:t>
+      </w:r>
+      <w:r>
+        <w:t xml:space="preserve">depth-3 search space on each dataset, the discovered rules prune</w:t>
+      </w:r>
+      <w:r>
+        <w:t xml:space="preserve"> </w:t>
+      </w:r>
+      <w:r>
+        <w:t xml:space="preserve">88–99.6% of dead subtrees with zero false negatives,</w:t>
+      </w:r>
+      <w:r>
+        <w:t xml:space="preserve"> </w:t>
+      </w:r>
+      <w:r>
+        <w:t xml:space="preserve">outperforming hand-crafted alternatives by 17–29 percentage</w:t>
+      </w:r>
+      <w:r>
+        <w:t xml:space="preserve"> </w:t>
+      </w:r>
+      <w:r>
+        <w:t xml:space="preserve">points. The Monotone Invariance Theorem enables F1 and AUROC</w:t>
+      </w:r>
+      <w:r>
+        <w:t xml:space="preserve"> </w:t>
+      </w:r>
+      <w:r>
+        <w:t xml:space="preserve">reuse for monotone transforms. The meta-search recipe</w:t>
+      </w:r>
+      <w:r>
+        <w:t xml:space="preserve"> </w:t>
+      </w:r>
+      <w:r>
+        <w:t xml:space="preserve">(exhaustive enumeration, viability labeling, criterion search</w:t>
+      </w:r>
+      <w:r>
+        <w:t xml:space="preserve"> </w:t>
+      </w:r>
+      <w:r>
+        <w:t xml:space="preserve">with threshold at the minimum alive-node value) is in principle</w:t>
+      </w:r>
+      <w:r>
+        <w:t xml:space="preserve"> </w:t>
+      </w:r>
+      <w:r>
+        <w:t xml:space="preserve">applicable to other tree searches with evaluable node features,</w:t>
+      </w:r>
+      <w:r>
+        <w:t xml:space="preserve"> </w:t>
+      </w:r>
+      <w:r>
+        <w:t xml:space="preserve">though this paper validates it only on the symbolic formula</w:t>
+      </w:r>
+      <w:r>
+        <w:t xml:space="preserve"> </w:t>
+      </w:r>
+      <w:r>
+        <w:t xml:space="preserve">search described here.</w:t>
+      </w:r>
+    </w:p>
+    <w:bookmarkEnd w:id="37"/>
+    <w:bookmarkStart w:id="38" w:name="impact-statement"/>
+    <w:p>
+      <w:pPr>
+        <w:pStyle w:val="Heading1"/>
+      </w:pPr>
+      <w:r>
+        <w:t xml:space="preserve">Impact Statement</w:t>
+      </w:r>
+    </w:p>
+    <w:p>
+      <w:pPr>
+        <w:pStyle w:val="FirstParagraph"/>
+      </w:pPr>
+      <w:r>
+        <w:t xml:space="preserve">This work introduces a method for discovering interpretable</w:t>
+      </w:r>
+      <w:r>
+        <w:t xml:space="preserve"> </w:t>
+      </w:r>
+      <w:r>
+        <w:t xml:space="preserve">symbolic classifiers that compete with ensemble methods on</w:t>
+      </w:r>
+      <w:r>
+        <w:t xml:space="preserve"> </w:t>
+      </w:r>
+      <w:r>
+        <w:t xml:space="preserve">tabular data. The primary positive impact is in domains where</w:t>
+      </w:r>
+      <w:r>
+        <w:t xml:space="preserve"> </w:t>
+      </w:r>
+      <w:r>
+        <w:t xml:space="preserve">model interpretability is legally or ethically required (medical</w:t>
+      </w:r>
+      <w:r>
+        <w:t xml:space="preserve"> </w:t>
+      </w:r>
+      <w:r>
+        <w:t xml:space="preserve">diagnosis, credit scoring, criminal justice): a clinician can</w:t>
+      </w:r>
+      <w:r>
+        <w:t xml:space="preserve"> </w:t>
+      </w:r>
+      <w:r>
+        <w:t xml:space="preserve">verify a three-term formula by hand, whereas a 100-tree gradient</w:t>
+      </w:r>
+      <w:r>
+        <w:t xml:space="preserve"> </w:t>
+      </w:r>
+      <w:r>
+        <w:t xml:space="preserve">boosting model is opaque.</w:t>
+      </w:r>
+    </w:p>
+    <w:p>
+      <w:pPr>
+        <w:pStyle w:val="BodyText"/>
+      </w:pPr>
+      <w:r>
+        <w:t xml:space="preserve">The meta-search technique—learning safe pruning rules from</w:t>
+      </w:r>
+      <w:r>
+        <w:t xml:space="preserve"> </w:t>
+      </w:r>
+      <w:r>
+        <w:t xml:space="preserve">exhaustive local search—is a general algorithmic contribution</w:t>
+      </w:r>
+      <w:r>
+        <w:t xml:space="preserve"> </w:t>
+      </w:r>
+      <w:r>
+        <w:t xml:space="preserve">with no domain-specific risks. The method does not generate</w:t>
+      </w:r>
+      <w:r>
+        <w:t xml:space="preserve"> </w:t>
+      </w:r>
+      <w:r>
+        <w:t xml:space="preserve">synthetic data, interact with humans, or make autonomous</w:t>
+      </w:r>
+      <w:r>
+        <w:t xml:space="preserve"> </w:t>
+      </w:r>
+      <w:r>
+        <w:t xml:space="preserve">decisions.</w:t>
+      </w:r>
+    </w:p>
+    <w:p>
+      <w:pPr>
+        <w:pStyle w:val="BodyText"/>
+      </w:pPr>
+      <w:r>
+        <w:t xml:space="preserve">A potential negative impact is over-reliance on simple formulas in</w:t>
+      </w:r>
+      <w:r>
+        <w:t xml:space="preserve"> </w:t>
+      </w:r>
+      <w:r>
+        <w:t xml:space="preserve">settings where ensemble methods are genuinely superior (high-dimensional</w:t>
+      </w:r>
+      <w:r>
+        <w:t xml:space="preserve"> </w:t>
+      </w:r>
+      <w:r>
+        <w:t xml:space="preserve">boundaries). Our evaluation explicitly identifies such cases</w:t>
+      </w:r>
+      <w:r>
+        <w:t xml:space="preserve"> </w:t>
+      </w:r>
+      <w:r>
+        <w:t xml:space="preserve">(Breast Cancer, Ionosphere) and reports them honestly, mitigating</w:t>
+      </w:r>
+      <w:r>
+        <w:t xml:space="preserve"> </w:t>
+      </w:r>
+      <w:r>
+        <w:t xml:space="preserve">this risk. We recommend that practitioners compare formula and</w:t>
+      </w:r>
+      <w:r>
+        <w:t xml:space="preserve"> </w:t>
+      </w:r>
+      <w:r>
+        <w:t xml:space="preserve">ensemble performance on their specific data before deploying.</w:t>
+      </w:r>
+    </w:p>
+    <w:p>
+      <w:pPr>
+        <w:pStyle w:val="BodyText"/>
+      </w:pPr>
+      <w:r>
+        <w:t xml:space="preserve">9</w:t>
+      </w:r>
+      <w:r>
+        <w:t xml:space="preserve"> </w:t>
+      </w:r>
+      <w:r>
+        <w:t xml:space="preserve">M. Schmidt and H. Lipson,</w:t>
+      </w:r>
+      <w:r>
+        <w:t xml:space="preserve"> </w:t>
+      </w:r>
+      <w:r>
+        <w:t xml:space="preserve">“Distilling free-form natural laws from</w:t>
+      </w:r>
+      <w:r>
+        <w:t xml:space="preserve"> </w:t>
+      </w:r>
+      <w:r>
+        <w:t xml:space="preserve">experimental data,”</w:t>
+      </w:r>
+      <w:r>
+        <w:t xml:space="preserve"> </w:t>
+      </w:r>
+      <w:r>
+        <w:rPr>
+          <w:i/>
+          <w:iCs/>
+        </w:rPr>
+        <w:t xml:space="preserve">Science</w:t>
+      </w:r>
+      <w:r>
+        <w:t xml:space="preserve">, vol. 324, pp. 81–85, 2009.</w:t>
+      </w:r>
+    </w:p>
+    <w:p>
+      <w:pPr>
+        <w:pStyle w:val="BodyText"/>
+      </w:pPr>
+      <w:r>
+        <w:t xml:space="preserve">S.-M. Udrescu and M. Tegmark,</w:t>
+      </w:r>
+      <w:r>
+        <w:t xml:space="preserve"> </w:t>
+      </w:r>
+      <w:r>
+        <w:t xml:space="preserve">“AI Feynman: A physics-inspired</w:t>
+      </w:r>
+      <w:r>
+        <w:t xml:space="preserve"> </w:t>
+      </w:r>
+      <w:r>
+        <w:t xml:space="preserve">method for symbolic regression,”</w:t>
+      </w:r>
+      <w:r>
+        <w:t xml:space="preserve"> </w:t>
+      </w:r>
+      <w:r>
+        <w:rPr>
+          <w:i/>
+          <w:iCs/>
+        </w:rPr>
+        <w:t xml:space="preserve">Sci. Adv.</w:t>
+      </w:r>
+      <w:r>
+        <w:t xml:space="preserve">, vol. 6,</w:t>
+      </w:r>
+      <w:r>
+        <w:t xml:space="preserve"> </w:t>
+      </w:r>
+      <w:r>
+        <w:t xml:space="preserve">eaay2631, 2020.</w:t>
+      </w:r>
+    </w:p>
+    <w:p>
+      <w:pPr>
+        <w:pStyle w:val="BodyText"/>
+      </w:pPr>
+      <w:r>
+        <w:t xml:space="preserve">M. Cranmer,</w:t>
+      </w:r>
+      <w:r>
+        <w:t xml:space="preserve"> </w:t>
+      </w:r>
+      <w:r>
+        <w:t xml:space="preserve">“Interpretable machine learning for science with PySR</w:t>
+      </w:r>
+      <w:r>
+        <w:t xml:space="preserve"> </w:t>
+      </w:r>
+      <w:r>
+        <w:t xml:space="preserve">and SymbolicRegression.jl,”</w:t>
+      </w:r>
+      <w:r>
+        <w:t xml:space="preserve"> </w:t>
+      </w:r>
+      <w:r>
+        <w:rPr>
+          <w:i/>
+          <w:iCs/>
+        </w:rPr>
+        <w:t xml:space="preserve">arXiv:2305.01582</w:t>
+      </w:r>
+      <w:r>
+        <w:t xml:space="preserve">, 2023.</w:t>
+      </w:r>
+    </w:p>
+    <w:p>
+      <w:pPr>
+        <w:pStyle w:val="BodyText"/>
+      </w:pPr>
+      <w:r>
+        <w:t xml:space="preserve">M. Kommenda</w:t>
+      </w:r>
+      <w:r>
+        <w:t xml:space="preserve"> </w:t>
+      </w:r>
+      <w:r>
+        <w:rPr>
+          <w:i/>
+          <w:iCs/>
+        </w:rPr>
+        <w:t xml:space="preserve">et al.</w:t>
+      </w:r>
+      <w:r>
+        <w:t xml:space="preserve">,</w:t>
+      </w:r>
+      <w:r>
+        <w:t xml:space="preserve"> </w:t>
+      </w:r>
+      <w:r>
+        <w:t xml:space="preserve">“Parameter identification for symbolic</w:t>
+      </w:r>
+      <w:r>
+        <w:t xml:space="preserve"> </w:t>
+      </w:r>
+      <w:r>
+        <w:t xml:space="preserve">regression using nonlinear least squares,”</w:t>
+      </w:r>
+      <w:r>
+        <w:t xml:space="preserve"> </w:t>
+      </w:r>
+      <w:r>
+        <w:rPr>
+          <w:i/>
+          <w:iCs/>
+        </w:rPr>
+        <w:t xml:space="preserve">Genetic Programming</w:t>
+      </w:r>
+      <w:r>
+        <w:rPr>
+          <w:i/>
+          <w:iCs/>
+        </w:rPr>
+        <w:t xml:space="preserve"> </w:t>
+      </w:r>
+      <w:r>
+        <w:rPr>
+          <w:i/>
+          <w:iCs/>
+        </w:rPr>
+        <w:t xml:space="preserve">and Evolvable Machines</w:t>
+      </w:r>
+      <w:r>
+        <w:t xml:space="preserve">, vol. 21, pp. 471–501, 2020.</w:t>
+      </w:r>
+    </w:p>
+    <w:p>
+      <w:pPr>
+        <w:pStyle w:val="BodyText"/>
+      </w:pPr>
+      <w:r>
+        <w:t xml:space="preserve">A. Felner</w:t>
+      </w:r>
+      <w:r>
+        <w:t xml:space="preserve"> </w:t>
+      </w:r>
+      <w:r>
+        <w:rPr>
+          <w:i/>
+          <w:iCs/>
+        </w:rPr>
+        <w:t xml:space="preserve">et al.</w:t>
+      </w:r>
+      <w:r>
+        <w:t xml:space="preserve">,</w:t>
+      </w:r>
+      <w:r>
+        <w:t xml:space="preserve"> </w:t>
+      </w:r>
+      <w:r>
+        <w:t xml:space="preserve">“Inconsistent heuristics in theory and</w:t>
+      </w:r>
+      <w:r>
+        <w:t xml:space="preserve"> </w:t>
+      </w:r>
+      <w:r>
+        <w:t xml:space="preserve">practice,”</w:t>
+      </w:r>
+      <w:r>
+        <w:t xml:space="preserve"> </w:t>
+      </w:r>
+      <w:r>
+        <w:rPr>
+          <w:i/>
+          <w:iCs/>
+        </w:rPr>
         <w:t xml:space="preserve">Artif. Intell.</w:t>
       </w:r>
       <w:r>
         <w:t xml:space="preserve">, vol. 175, pp. 1570–1603, 2011.</w:t>
       </w:r>
     </w:p>
-    <w:bookmarkEnd w:id="35"/>
+    <w:p>
+      <w:pPr>
+        <w:pStyle w:val="BodyText"/>
+      </w:pPr>
+      <w:r>
+        <w:t xml:space="preserve">J. P. Sullins,</w:t>
+      </w:r>
+      <w:r>
+        <w:t xml:space="preserve"> </w:t>
+      </w:r>
+      <w:r>
+        <w:t xml:space="preserve">“When is a robot a moral agent?”</w:t>
+      </w:r>
+      <w:r>
+        <w:t xml:space="preserve"> </w:t>
+      </w:r>
+      <w:r>
+        <w:rPr>
+          <w:i/>
+          <w:iCs/>
+        </w:rPr>
+        <w:t xml:space="preserve">International Review of Information Ethics</w:t>
+      </w:r>
+      <w:r>
+        <w:t xml:space="preserve">, vol. 6,</w:t>
+      </w:r>
+      <w:r>
+        <w:t xml:space="preserve"> </w:t>
+      </w:r>
+      <w:r>
+        <w:t xml:space="preserve">pp. 23–30, 2006.</w:t>
+      </w:r>
+    </w:p>
+    <w:bookmarkEnd w:id="38"/>
     <w:sectPr>
       <w:footnotePr>
         <w:numRestart w:val="eachSect"/>

</xml_diff>